<commit_message>
Added new print and scan syntax
</commit_message>
<xml_diff>
--- a/docx/manual/FizzBuzz.docx
+++ b/docx/manual/FizzBuzz.docx
@@ -9,14 +9,12 @@
           <w:rFonts w:ascii="Times New Roman" w:hAnsi="Times New Roman" w:cs="Times New Roman"/>
         </w:rPr>
       </w:pPr>
-      <w:proofErr w:type="spellStart"/>
       <w:r>
         <w:rPr>
           <w:rFonts w:ascii="Times New Roman" w:hAnsi="Times New Roman" w:cs="Times New Roman"/>
         </w:rPr>
         <w:t>FizzBuzz</w:t>
       </w:r>
-      <w:proofErr w:type="spellEnd"/>
     </w:p>
     <w:p>
       <w:pPr>
@@ -112,7 +110,6 @@
                 <w:iCs/>
               </w:rPr>
             </w:pPr>
-            <w:proofErr w:type="spellStart"/>
             <w:r>
               <w:rPr>
                 <w:rStyle w:val="SubtleReference"/>
@@ -121,7 +118,6 @@
               </w:rPr>
               <w:t>FizzBuzz</w:t>
             </w:r>
-            <w:proofErr w:type="spellEnd"/>
           </w:p>
         </w:tc>
         <w:tc>
@@ -308,16 +304,18 @@
             <w:gridSpan w:val="4"/>
           </w:tcPr>
           <w:p>
-            <w:r>
-              <w:t xml:space="preserve">I % 3 = </w:t>
-            </w:r>
-            <w:proofErr w:type="gramStart"/>
-            <w:r>
-              <w:t>0 ∧ I</w:t>
-            </w:r>
-            <w:proofErr w:type="gramEnd"/>
-            <w:r>
-              <w:t xml:space="preserve"> % 5 = 0</w:t>
+            <w:commentRangeStart w:id="0"/>
+            <w:r>
+              <w:t>I % 3 = 0 ∧ I % 5 = 0</w:t>
+            </w:r>
+            <w:commentRangeEnd w:id="0"/>
+            <w:r>
+              <w:rPr>
+                <w:rStyle w:val="CommentReference"/>
+                <w:sz w:val="24"/>
+                <w:szCs w:val="24"/>
+              </w:rPr>
+              <w:commentReference w:id="0"/>
             </w:r>
           </w:p>
         </w:tc>
@@ -455,7 +453,6 @@
             <w:tcW w:w="3117" w:type="dxa"/>
           </w:tcPr>
           <w:p>
-            <w:proofErr w:type="gramStart"/>
             <w:r>
               <w:t xml:space="preserve">I </w:t>
             </w:r>
@@ -469,14 +466,7 @@
               <w:rPr>
                 <w:rFonts w:ascii="Courier New" w:hAnsi="Courier New"/>
               </w:rPr>
-              <w:t xml:space="preserve"> I</w:t>
-            </w:r>
-            <w:proofErr w:type="gramEnd"/>
-            <w:r>
-              <w:rPr>
-                <w:rFonts w:ascii="Courier New" w:hAnsi="Courier New"/>
-              </w:rPr>
-              <w:t xml:space="preserve"> + 1</w:t>
+              <w:t xml:space="preserve"> I + 1</w:t>
             </w:r>
           </w:p>
         </w:tc>
@@ -497,31 +487,13 @@
             <w:r>
               <w:t xml:space="preserve">Print </w:t>
             </w:r>
-            <w:proofErr w:type="spellStart"/>
             <w:r>
               <w:rPr>
                 <w:b/>
                 <w:bCs/>
               </w:rPr>
-              <w:t>FizzBuzz</w:t>
-            </w:r>
-            <w:proofErr w:type="spellEnd"/>
-            <w:r>
-              <w:rPr>
-                <w:b/>
-                <w:bCs/>
-              </w:rPr>
-              <w:t xml:space="preserve"> </w:t>
-            </w:r>
-            <w:proofErr w:type="spellStart"/>
-            <w:r>
-              <w:rPr>
-                <w:b/>
-                <w:bCs/>
-              </w:rPr>
-              <w:t>i</w:t>
-            </w:r>
-            <w:proofErr w:type="spellEnd"/>
+              <w:t>FizzBuzz i</w:t>
+            </w:r>
           </w:p>
         </w:tc>
       </w:tr>
@@ -678,6 +650,53 @@
     </w:sectPr>
   </w:body>
 </w:document>
+</file>
+
+<file path=word/comments.xml><?xml version="1.0" encoding="utf-8"?>
+<w:comments xmlns:wpc="http://schemas.microsoft.com/office/word/2010/wordprocessingCanvas" xmlns:cx="http://schemas.microsoft.com/office/drawing/2014/chartex" xmlns:cx1="http://schemas.microsoft.com/office/drawing/2015/9/8/chartex" xmlns:cx2="http://schemas.microsoft.com/office/drawing/2015/10/21/chartex" xmlns:cx3="http://schemas.microsoft.com/office/drawing/2016/5/9/chartex" xmlns:cx4="http://schemas.microsoft.com/office/drawing/2016/5/10/chartex" xmlns:cx5="http://schemas.microsoft.com/office/drawing/2016/5/11/chartex" xmlns:cx6="http://schemas.microsoft.com/office/drawing/2016/5/12/chartex" xmlns:cx7="http://schemas.microsoft.com/office/drawing/2016/5/13/chartex" xmlns:cx8="http://schemas.microsoft.com/office/drawing/2016/5/14/chartex" xmlns:mc="http://schemas.openxmlformats.org/markup-compatibility/2006" xmlns:aink="http://schemas.microsoft.com/office/drawing/2016/ink" xmlns:am3d="http://schemas.microsoft.com/office/drawing/2017/model3d" xmlns:o="urn:schemas-microsoft-com:office:office" xmlns:oel="http://schemas.microsoft.com/office/2019/extlst" xmlns:r="http://schemas.openxmlformats.org/officeDocument/2006/relationships" xmlns:m="http://schemas.openxmlformats.org/officeDocument/2006/math" xmlns:v="urn:schemas-microsoft-com:vml" xmlns:wp14="http://schemas.microsoft.com/office/word/2010/wordprocessingDrawing" xmlns:wp="http://schemas.openxmlformats.org/drawingml/2006/wordprocessingDrawing" xmlns:w10="urn:schemas-microsoft-com:office:word" xmlns:w="http://schemas.openxmlformats.org/wordprocessingml/2006/main" xmlns:w14="http://schemas.microsoft.com/office/word/2010/wordml" xmlns:w15="http://schemas.microsoft.com/office/word/2012/wordml" xmlns:w16cex="http://schemas.microsoft.com/office/word/2018/wordml/cex" xmlns:w16cid="http://schemas.microsoft.com/office/word/2016/wordml/cid" xmlns:w16="http://schemas.microsoft.com/office/word/2018/wordml" xmlns:w16du="http://schemas.microsoft.com/office/word/2023/wordml/word16du" xmlns:w16sdtdh="http://schemas.microsoft.com/office/word/2020/wordml/sdtdatahash" xmlns:w16sdtfl="http://schemas.microsoft.com/office/word/2024/wordml/sdtformatlock" xmlns:w16se="http://schemas.microsoft.com/office/word/2015/wordml/symex" xmlns:wpg="http://schemas.microsoft.com/office/word/2010/wordprocessingGroup" xmlns:wpi="http://schemas.microsoft.com/office/word/2010/wordprocessingInk" xmlns:wne="http://schemas.microsoft.com/office/word/2006/wordml" xmlns:wps="http://schemas.microsoft.com/office/word/2010/wordprocessingShape" mc:Ignorable="w14 w15 w16se w16cid w16 w16cex w16sdtdh w16sdtfl w16du wp14">
+  <w:comment w:id="0" w:author="xander naumenko" w:date="2026-03-15T10:48:00Z" w:initials="xn">
+    <w:p>
+      <w:pPr>
+        <w:pStyle w:val="CommentText"/>
+      </w:pPr>
+      <w:r>
+        <w:rPr>
+          <w:rStyle w:val="CommentReference"/>
+        </w:rPr>
+        <w:annotationRef/>
+      </w:r>
+      <w:r>
+        <w:t>This is a comment. This checks if I is divisible by 3 and 5, i.e. divisible by 15.</w:t>
+      </w:r>
+    </w:p>
+  </w:comment>
+</w:comments>
+</file>
+
+<file path=word/commentsExtended.xml><?xml version="1.0" encoding="utf-8"?>
+<w15:commentsEx xmlns:wpc="http://schemas.microsoft.com/office/word/2010/wordprocessingCanvas" xmlns:cx="http://schemas.microsoft.com/office/drawing/2014/chartex" xmlns:cx1="http://schemas.microsoft.com/office/drawing/2015/9/8/chartex" xmlns:cx2="http://schemas.microsoft.com/office/drawing/2015/10/21/chartex" xmlns:cx3="http://schemas.microsoft.com/office/drawing/2016/5/9/chartex" xmlns:cx4="http://schemas.microsoft.com/office/drawing/2016/5/10/chartex" xmlns:cx5="http://schemas.microsoft.com/office/drawing/2016/5/11/chartex" xmlns:cx6="http://schemas.microsoft.com/office/drawing/2016/5/12/chartex" xmlns:cx7="http://schemas.microsoft.com/office/drawing/2016/5/13/chartex" xmlns:cx8="http://schemas.microsoft.com/office/drawing/2016/5/14/chartex" xmlns:mc="http://schemas.openxmlformats.org/markup-compatibility/2006" xmlns:aink="http://schemas.microsoft.com/office/drawing/2016/ink" xmlns:am3d="http://schemas.microsoft.com/office/drawing/2017/model3d" xmlns:o="urn:schemas-microsoft-com:office:office" xmlns:oel="http://schemas.microsoft.com/office/2019/extlst" xmlns:r="http://schemas.openxmlformats.org/officeDocument/2006/relationships" xmlns:m="http://schemas.openxmlformats.org/officeDocument/2006/math" xmlns:v="urn:schemas-microsoft-com:vml" xmlns:wp14="http://schemas.microsoft.com/office/word/2010/wordprocessingDrawing" xmlns:wp="http://schemas.openxmlformats.org/drawingml/2006/wordprocessingDrawing" xmlns:w10="urn:schemas-microsoft-com:office:word" xmlns:w="http://schemas.openxmlformats.org/wordprocessingml/2006/main" xmlns:w14="http://schemas.microsoft.com/office/word/2010/wordml" xmlns:w15="http://schemas.microsoft.com/office/word/2012/wordml" xmlns:w16cex="http://schemas.microsoft.com/office/word/2018/wordml/cex" xmlns:w16cid="http://schemas.microsoft.com/office/word/2016/wordml/cid" xmlns:w16="http://schemas.microsoft.com/office/word/2018/wordml" xmlns:w16du="http://schemas.microsoft.com/office/word/2023/wordml/word16du" xmlns:w16sdtdh="http://schemas.microsoft.com/office/word/2020/wordml/sdtdatahash" xmlns:w16sdtfl="http://schemas.microsoft.com/office/word/2024/wordml/sdtformatlock" xmlns:w16se="http://schemas.microsoft.com/office/word/2015/wordml/symex" xmlns:wpg="http://schemas.microsoft.com/office/word/2010/wordprocessingGroup" xmlns:wpi="http://schemas.microsoft.com/office/word/2010/wordprocessingInk" xmlns:wne="http://schemas.microsoft.com/office/word/2006/wordml" xmlns:wps="http://schemas.microsoft.com/office/word/2010/wordprocessingShape" mc:Ignorable="w14 w15 w16se w16cid w16 w16cex w16sdtdh w16sdtfl w16du wp14">
+  <w15:commentEx w15:paraId="705F2993" w15:done="0"/>
+</w15:commentsEx>
+</file>
+
+<file path=word/commentsExtensible.xml><?xml version="1.0" encoding="utf-8"?>
+<w16cex:commentsExtensible xmlns:wpc="http://schemas.microsoft.com/office/word/2010/wordprocessingCanvas" xmlns:cx="http://schemas.microsoft.com/office/drawing/2014/chartex" xmlns:cx1="http://schemas.microsoft.com/office/drawing/2015/9/8/chartex" xmlns:cx2="http://schemas.microsoft.com/office/drawing/2015/10/21/chartex" xmlns:cx3="http://schemas.microsoft.com/office/drawing/2016/5/9/chartex" xmlns:cx4="http://schemas.microsoft.com/office/drawing/2016/5/10/chartex" xmlns:cx5="http://schemas.microsoft.com/office/drawing/2016/5/11/chartex" xmlns:cx6="http://schemas.microsoft.com/office/drawing/2016/5/12/chartex" xmlns:cx7="http://schemas.microsoft.com/office/drawing/2016/5/13/chartex" xmlns:cx8="http://schemas.microsoft.com/office/drawing/2016/5/14/chartex" xmlns:cr="http://schemas.microsoft.com/office/comments/2020/reactions" xmlns:mc="http://schemas.openxmlformats.org/markup-compatibility/2006" xmlns:aink="http://schemas.microsoft.com/office/drawing/2016/ink" xmlns:am3d="http://schemas.microsoft.com/office/drawing/2017/model3d" xmlns:o="urn:schemas-microsoft-com:office:office" xmlns:oel="http://schemas.microsoft.com/office/2019/extlst" xmlns:r="http://schemas.openxmlformats.org/officeDocument/2006/relationships" xmlns:m="http://schemas.openxmlformats.org/officeDocument/2006/math" xmlns:v="urn:schemas-microsoft-com:vml" xmlns:wp14="http://schemas.microsoft.com/office/word/2010/wordprocessingDrawing" xmlns:wp="http://schemas.openxmlformats.org/drawingml/2006/wordprocessingDrawing" xmlns:w10="urn:schemas-microsoft-com:office:word" xmlns:w="http://schemas.openxmlformats.org/wordprocessingml/2006/main" xmlns:w14="http://schemas.microsoft.com/office/word/2010/wordml" xmlns:w15="http://schemas.microsoft.com/office/word/2012/wordml" xmlns:w16cex="http://schemas.microsoft.com/office/word/2018/wordml/cex" xmlns:w16cid="http://schemas.microsoft.com/office/word/2016/wordml/cid" xmlns:w16="http://schemas.microsoft.com/office/word/2018/wordml" xmlns:w16du="http://schemas.microsoft.com/office/word/2023/wordml/word16du" xmlns:w16sdtdh="http://schemas.microsoft.com/office/word/2020/wordml/sdtdatahash" xmlns:w16sdtfl="http://schemas.microsoft.com/office/word/2024/wordml/sdtformatlock" xmlns:w16se="http://schemas.microsoft.com/office/word/2015/wordml/symex" xmlns:wpg="http://schemas.microsoft.com/office/word/2010/wordprocessingGroup" xmlns:wpi="http://schemas.microsoft.com/office/word/2010/wordprocessingInk" xmlns:wne="http://schemas.microsoft.com/office/word/2006/wordml" xmlns:wps="http://schemas.microsoft.com/office/word/2010/wordprocessingShape" mc:Ignorable="w14 w15 w16se w16cid w16 w16cex w16sdtdh w16sdtfl cr w16du wp14">
+  <w16cex:commentExtensible w16cex:durableId="69C3A7C5" w16cex:dateUtc="2026-03-15T17:48:00Z"/>
+</w16cex:commentsExtensible>
+</file>
+
+<file path=word/commentsIds.xml><?xml version="1.0" encoding="utf-8"?>
+<w16cid:commentsIds xmlns:wpc="http://schemas.microsoft.com/office/word/2010/wordprocessingCanvas" xmlns:cx="http://schemas.microsoft.com/office/drawing/2014/chartex" xmlns:cx1="http://schemas.microsoft.com/office/drawing/2015/9/8/chartex" xmlns:cx2="http://schemas.microsoft.com/office/drawing/2015/10/21/chartex" xmlns:cx3="http://schemas.microsoft.com/office/drawing/2016/5/9/chartex" xmlns:cx4="http://schemas.microsoft.com/office/drawing/2016/5/10/chartex" xmlns:cx5="http://schemas.microsoft.com/office/drawing/2016/5/11/chartex" xmlns:cx6="http://schemas.microsoft.com/office/drawing/2016/5/12/chartex" xmlns:cx7="http://schemas.microsoft.com/office/drawing/2016/5/13/chartex" xmlns:cx8="http://schemas.microsoft.com/office/drawing/2016/5/14/chartex" xmlns:mc="http://schemas.openxmlformats.org/markup-compatibility/2006" xmlns:aink="http://schemas.microsoft.com/office/drawing/2016/ink" xmlns:am3d="http://schemas.microsoft.com/office/drawing/2017/model3d" xmlns:o="urn:schemas-microsoft-com:office:office" xmlns:oel="http://schemas.microsoft.com/office/2019/extlst" xmlns:r="http://schemas.openxmlformats.org/officeDocument/2006/relationships" xmlns:m="http://schemas.openxmlformats.org/officeDocument/2006/math" xmlns:v="urn:schemas-microsoft-com:vml" xmlns:wp14="http://schemas.microsoft.com/office/word/2010/wordprocessingDrawing" xmlns:wp="http://schemas.openxmlformats.org/drawingml/2006/wordprocessingDrawing" xmlns:w10="urn:schemas-microsoft-com:office:word" xmlns:w="http://schemas.openxmlformats.org/wordprocessingml/2006/main" xmlns:w14="http://schemas.microsoft.com/office/word/2010/wordml" xmlns:w15="http://schemas.microsoft.com/office/word/2012/wordml" xmlns:w16cex="http://schemas.microsoft.com/office/word/2018/wordml/cex" xmlns:w16cid="http://schemas.microsoft.com/office/word/2016/wordml/cid" xmlns:w16="http://schemas.microsoft.com/office/word/2018/wordml" xmlns:w16du="http://schemas.microsoft.com/office/word/2023/wordml/word16du" xmlns:w16sdtdh="http://schemas.microsoft.com/office/word/2020/wordml/sdtdatahash" xmlns:w16sdtfl="http://schemas.microsoft.com/office/word/2024/wordml/sdtformatlock" xmlns:w16se="http://schemas.microsoft.com/office/word/2015/wordml/symex" xmlns:wpg="http://schemas.microsoft.com/office/word/2010/wordprocessingGroup" xmlns:wpi="http://schemas.microsoft.com/office/word/2010/wordprocessingInk" xmlns:wne="http://schemas.microsoft.com/office/word/2006/wordml" xmlns:wps="http://schemas.microsoft.com/office/word/2010/wordprocessingShape" mc:Ignorable="w14 w15 w16se w16cid w16 w16cex w16sdtdh w16sdtfl w16du wp14">
+  <w16cid:commentId w16cid:paraId="705F2993" w16cid:durableId="69C3A7C5"/>
+</w16cid:commentsIds>
+</file>
+
+<file path=word/people.xml><?xml version="1.0" encoding="utf-8"?>
+<w15:people xmlns:wpc="http://schemas.microsoft.com/office/word/2010/wordprocessingCanvas" xmlns:cx="http://schemas.microsoft.com/office/drawing/2014/chartex" xmlns:cx1="http://schemas.microsoft.com/office/drawing/2015/9/8/chartex" xmlns:cx2="http://schemas.microsoft.com/office/drawing/2015/10/21/chartex" xmlns:cx3="http://schemas.microsoft.com/office/drawing/2016/5/9/chartex" xmlns:cx4="http://schemas.microsoft.com/office/drawing/2016/5/10/chartex" xmlns:cx5="http://schemas.microsoft.com/office/drawing/2016/5/11/chartex" xmlns:cx6="http://schemas.microsoft.com/office/drawing/2016/5/12/chartex" xmlns:cx7="http://schemas.microsoft.com/office/drawing/2016/5/13/chartex" xmlns:cx8="http://schemas.microsoft.com/office/drawing/2016/5/14/chartex" xmlns:mc="http://schemas.openxmlformats.org/markup-compatibility/2006" xmlns:aink="http://schemas.microsoft.com/office/drawing/2016/ink" xmlns:am3d="http://schemas.microsoft.com/office/drawing/2017/model3d" xmlns:o="urn:schemas-microsoft-com:office:office" xmlns:oel="http://schemas.microsoft.com/office/2019/extlst" xmlns:r="http://schemas.openxmlformats.org/officeDocument/2006/relationships" xmlns:m="http://schemas.openxmlformats.org/officeDocument/2006/math" xmlns:v="urn:schemas-microsoft-com:vml" xmlns:wp14="http://schemas.microsoft.com/office/word/2010/wordprocessingDrawing" xmlns:wp="http://schemas.openxmlformats.org/drawingml/2006/wordprocessingDrawing" xmlns:w10="urn:schemas-microsoft-com:office:word" xmlns:w="http://schemas.openxmlformats.org/wordprocessingml/2006/main" xmlns:w14="http://schemas.microsoft.com/office/word/2010/wordml" xmlns:w15="http://schemas.microsoft.com/office/word/2012/wordml" xmlns:w16cex="http://schemas.microsoft.com/office/word/2018/wordml/cex" xmlns:w16cid="http://schemas.microsoft.com/office/word/2016/wordml/cid" xmlns:w16="http://schemas.microsoft.com/office/word/2018/wordml" xmlns:w16du="http://schemas.microsoft.com/office/word/2023/wordml/word16du" xmlns:w16sdtdh="http://schemas.microsoft.com/office/word/2020/wordml/sdtdatahash" xmlns:w16sdtfl="http://schemas.microsoft.com/office/word/2024/wordml/sdtformatlock" xmlns:w16se="http://schemas.microsoft.com/office/word/2015/wordml/symex" xmlns:wpg="http://schemas.microsoft.com/office/word/2010/wordprocessingGroup" xmlns:wpi="http://schemas.microsoft.com/office/word/2010/wordprocessingInk" xmlns:wne="http://schemas.microsoft.com/office/word/2006/wordml" xmlns:wps="http://schemas.microsoft.com/office/word/2010/wordprocessingShape" mc:Ignorable="w14 w15 w16se w16cid w16 w16cex w16sdtdh w16sdtfl w16du wp14">
+  <w15:person w15:author="xander naumenko">
+    <w15:presenceInfo w15:providerId="Windows Live" w15:userId="37289626886921ec"/>
+  </w15:person>
+</w15:people>
 </file>
 
 <file path=word/styles.xml><?xml version="1.0" encoding="utf-8"?>
@@ -1635,6 +1654,72 @@
     <w:unhideWhenUsed/>
     <w:rsid w:val="00B213B0"/>
   </w:style>
+  <w:style w:type="character" w:styleId="CommentReference">
+    <w:name w:val="annotation reference"/>
+    <w:basedOn w:val="DefaultParagraphFont"/>
+    <w:uiPriority w:val="99"/>
+    <w:semiHidden/>
+    <w:unhideWhenUsed/>
+    <w:rsid w:val="008F6232"/>
+    <w:rPr>
+      <w:sz w:val="16"/>
+      <w:szCs w:val="16"/>
+    </w:rPr>
+  </w:style>
+  <w:style w:type="paragraph" w:styleId="CommentText">
+    <w:name w:val="annotation text"/>
+    <w:basedOn w:val="Normal"/>
+    <w:link w:val="CommentTextChar"/>
+    <w:uiPriority w:val="99"/>
+    <w:unhideWhenUsed/>
+    <w:rsid w:val="008F6232"/>
+    <w:pPr>
+      <w:spacing w:line="240" w:lineRule="auto"/>
+    </w:pPr>
+    <w:rPr>
+      <w:sz w:val="20"/>
+      <w:szCs w:val="20"/>
+    </w:rPr>
+  </w:style>
+  <w:style w:type="character" w:customStyle="1" w:styleId="CommentTextChar">
+    <w:name w:val="Comment Text Char"/>
+    <w:basedOn w:val="DefaultParagraphFont"/>
+    <w:link w:val="CommentText"/>
+    <w:uiPriority w:val="99"/>
+    <w:rsid w:val="008F6232"/>
+    <w:rPr>
+      <w:sz w:val="20"/>
+      <w:szCs w:val="20"/>
+    </w:rPr>
+  </w:style>
+  <w:style w:type="paragraph" w:styleId="CommentSubject">
+    <w:name w:val="annotation subject"/>
+    <w:basedOn w:val="CommentText"/>
+    <w:next w:val="CommentText"/>
+    <w:link w:val="CommentSubjectChar"/>
+    <w:uiPriority w:val="99"/>
+    <w:semiHidden/>
+    <w:unhideWhenUsed/>
+    <w:rsid w:val="008F6232"/>
+    <w:rPr>
+      <w:b/>
+      <w:bCs/>
+    </w:rPr>
+  </w:style>
+  <w:style w:type="character" w:customStyle="1" w:styleId="CommentSubjectChar">
+    <w:name w:val="Comment Subject Char"/>
+    <w:basedOn w:val="CommentTextChar"/>
+    <w:link w:val="CommentSubject"/>
+    <w:uiPriority w:val="99"/>
+    <w:semiHidden/>
+    <w:rsid w:val="008F6232"/>
+    <w:rPr>
+      <w:b/>
+      <w:bCs/>
+      <w:sz w:val="20"/>
+      <w:szCs w:val="20"/>
+    </w:rPr>
+  </w:style>
 </w:styles>
 </file>
 

</xml_diff>